<commit_message>
Update sole author in both manuscripts
</commit_message>
<xml_diff>
--- a/article/SUMMA2026_EN_gradient_geometry.docx
+++ b/article/SUMMA2026_EN_gradient_geometry.docx
@@ -24,7 +24,7 @@
           <w:rFonts w:ascii="Times New Roman" w:hAnsi="Times New Roman" w:eastAsia="Times New Roman"/>
           <w:sz w:val="22"/>
         </w:rPr>
-        <w:t>Alexey P. Malakhov</w:t>
+        <w:t>Petr Vladimirovich Nikitin, Candidate of Pedagogical Sciences, Associate Professor</w:t>
       </w:r>
     </w:p>
     <w:p>
@@ -38,7 +38,7 @@
           <w:i/>
           <w:sz w:val="20"/>
         </w:rPr>
-        <w:t>Department of Artificial Intelligence, Faculty of Information Technology and Big Data Analysis</w:t>
+        <w:t>Associate Professor, Department of Artificial Intelligence</w:t>
       </w:r>
     </w:p>
     <w:p>
@@ -52,7 +52,7 @@
           <w:i/>
           <w:sz w:val="20"/>
         </w:rPr>
-        <w:t>Financial University under the Government of the Russian Federation, Moscow, Russia</w:t>
+        <w:t>Financial University under the Government of the Russian Federation</w:t>
       </w:r>
     </w:p>
     <w:p>
@@ -65,7 +65,7 @@
           <w:rFonts w:ascii="Times New Roman" w:hAnsi="Times New Roman" w:eastAsia="Times New Roman"/>
           <w:sz w:val="18"/>
         </w:rPr>
-        <w:t>[add email address or ORCID before submission]</w:t>
+        <w:t>Moscow, Russia</w:t>
       </w:r>
     </w:p>
     <w:p>

</xml_diff>